<commit_message>
Assorbimento energetico, +8 alle prove con velocità di movimento, Anfibio
- Immunità a un'energia sostituita da Assorbimento energetico (richiede Immunità alla stessa energia)
- +8 a Scalare/Nuotare/Volare quando l'eidolon ha la velocità corrispondente
- Anfibio dà Nuotare pari alla velocità su terreno

Co-Authored-By: Claude Opus 5.5 <noreply@anthropic.com>
Claude-Session: https://claude.ai/code/session_018CdRfLvvEjwCFEXtY2SLwC
</commit_message>
<xml_diff>
--- a/sorgenti/docx/Convocatore_v2.4_FINALE.docx
+++ b/sorgenti/docx/Convocatore_v2.4_FINALE.docx
@@ -40188,7 +40188,7 @@
           <w:sz w:val="22"/>
           <w:szCs w:val="22"/>
         </w:rPr>
-        <w:t>Evanescenza (Sop)</w:t>
+        <w:t>Assorbimento energetico (Sop)</w:t>
       </w:r>
     </w:p>
     <w:p>
@@ -40209,7 +40209,7 @@
           <w:sz w:val="21"/>
           <w:szCs w:val="21"/>
         </w:rPr>
-        <w:t>Requisiti: Convocatore di 15° livello.</w:t>
+        <w:t>Requisiti: Convocatore di 9° livello; evoluzione Immunità (Sop) associata alla stessa energia.</w:t>
       </w:r>
     </w:p>
     <w:p>
@@ -40230,28 +40230,7 @@
           <w:sz w:val="22"/>
           <w:szCs w:val="22"/>
         </w:rPr>
-        <w:t>Una volta al giorno, come azione veloce l’eidolon può ottenere per 5 round una probabilità di essere mancato del 45%.</w:t>
-      </w:r>
-    </w:p>
-    <w:p>
-      <w:pPr>
-        <w:pStyle w:val="Normal"/>
-        <w:keepNext w:val="true"/>
-        <w:spacing w:before="130" w:after="20"/>
-        <w:rPr/>
-      </w:pPr>
-      <w:r>
-        <w:rPr>
-          <w:rFonts w:eastAsia="Times New Roman" w:cs="Times New Roman"/>
-          <w:b/>
-          <w:bCs/>
-          <w:i w:val="false"/>
-          <w:iCs w:val="false"/>
-          <w:color w:val="000000"/>
-          <w:sz w:val="22"/>
-          <w:szCs w:val="22"/>
-        </w:rPr>
-        <w:t>Guarigione</w:t>
+        <w:t>Quando l’eidolon subisce danni del tipo di energia a cui è immune, invece di ignorarli recupera un numero di Punti Ferita pari alla metà dei danni che avrebbe subito, senza superare i propri Punti Ferita massimali.</w:t>
       </w:r>
     </w:p>
     <w:p>
@@ -40272,28 +40251,7 @@
           <w:sz w:val="21"/>
           <w:szCs w:val="21"/>
         </w:rPr>
-        <w:t>Requisiti: Convocatore di 11° livello.</w:t>
-      </w:r>
-    </w:p>
-    <w:p>
-      <w:pPr>
-        <w:pStyle w:val="Normal"/>
-        <w:spacing w:lineRule="auto" w:line="262" w:before="20" w:after="50"/>
-        <w:jc w:val="both"/>
-        <w:rPr/>
-      </w:pPr>
-      <w:r>
-        <w:rPr>
-          <w:rFonts w:eastAsia="Times New Roman" w:cs="Times New Roman"/>
-          <w:b w:val="false"/>
-          <w:bCs w:val="false"/>
-          <w:i w:val="false"/>
-          <w:iCs w:val="false"/>
-          <w:color w:val="000000"/>
-          <w:sz w:val="22"/>
-          <w:szCs w:val="22"/>
-        </w:rPr>
-        <w:t>Dopo essersi focalizzato per 1 minuto, l'eidolon ottiene Guarigione rapida 1. Si può curare in questo modo un massimo di danni al giorno pari ai Punti Ferita dell’eidolon.</w:t>
+        <w:t>Speciale: Questa evoluzione può essere selezionata più volte, ma ognuna deve essere associata a un’energia diversa a cui l’eidolon è immune.</w:t>
       </w:r>
     </w:p>
     <w:p>
@@ -40314,7 +40272,7 @@
           <w:sz w:val="22"/>
           <w:szCs w:val="22"/>
         </w:rPr>
-        <w:t>Immunità a un’energia</w:t>
+        <w:t>Evanescenza (Sop)</w:t>
       </w:r>
     </w:p>
     <w:p>
@@ -40335,7 +40293,7 @@
           <w:sz w:val="21"/>
           <w:szCs w:val="21"/>
         </w:rPr>
-        <w:t>Requisiti: Convocatore di 9° livello.</w:t>
+        <w:t>Requisiti: Convocatore di 15° livello.</w:t>
       </w:r>
     </w:p>
     <w:p>
@@ -40356,7 +40314,28 @@
           <w:sz w:val="22"/>
           <w:szCs w:val="22"/>
         </w:rPr>
-        <w:t>L’eidolon sceglie un tipo di energia tra acido, elettricità, freddo o fuoco e diventa immune ai danni di quel tipo.</w:t>
+        <w:t>Una volta al giorno, come azione veloce l’eidolon può ottenere per 5 round una probabilità di essere mancato del 45%.</w:t>
+      </w:r>
+    </w:p>
+    <w:p>
+      <w:pPr>
+        <w:pStyle w:val="Normal"/>
+        <w:keepNext w:val="true"/>
+        <w:spacing w:before="130" w:after="20"/>
+        <w:rPr/>
+      </w:pPr>
+      <w:r>
+        <w:rPr>
+          <w:rFonts w:eastAsia="Times New Roman" w:cs="Times New Roman"/>
+          <w:b/>
+          <w:bCs/>
+          <w:i w:val="false"/>
+          <w:iCs w:val="false"/>
+          <w:color w:val="000000"/>
+          <w:sz w:val="22"/>
+          <w:szCs w:val="22"/>
+        </w:rPr>
+        <w:t>Guarigione</w:t>
       </w:r>
     </w:p>
     <w:p>
@@ -40377,7 +40356,28 @@
           <w:sz w:val="21"/>
           <w:szCs w:val="21"/>
         </w:rPr>
-        <w:t>Speciale: selezionabile più volte, ogni volta per un tipo di energia diverso.</w:t>
+        <w:t>Requisiti: Convocatore di 11° livello.</w:t>
+      </w:r>
+    </w:p>
+    <w:p>
+      <w:pPr>
+        <w:pStyle w:val="Normal"/>
+        <w:spacing w:lineRule="auto" w:line="262" w:before="20" w:after="50"/>
+        <w:jc w:val="both"/>
+        <w:rPr/>
+      </w:pPr>
+      <w:r>
+        <w:rPr>
+          <w:rFonts w:eastAsia="Times New Roman" w:cs="Times New Roman"/>
+          <w:b w:val="false"/>
+          <w:bCs w:val="false"/>
+          <w:i w:val="false"/>
+          <w:iCs w:val="false"/>
+          <w:color w:val="000000"/>
+          <w:sz w:val="22"/>
+          <w:szCs w:val="22"/>
+        </w:rPr>
+        <w:t>Dopo essersi focalizzato per 1 minuto, l'eidolon ottiene Guarigione rapida 1. Si può curare in questo modo un massimo di danni al giorno pari ai Punti Ferita dell’eidolon.</w:t>
       </w:r>
     </w:p>
     <w:p>

</xml_diff>